<commit_message>
chen hinh anh ban than
</commit_message>
<xml_diff>
--- a/LAB5/LAB5_CNPM2_1150080122_NguyenThiBachVien.docx
+++ b/LAB5/LAB5_CNPM2_1150080122_NguyenThiBachVien.docx
@@ -1,6 +1,6 @@
 
 <file path=word/document.xml><?xml version="1.0" encoding="utf-8"?>
-<w:document xmlns:wpc="http://schemas.microsoft.com/office/word/2010/wordprocessingCanvas" xmlns:cx="http://schemas.microsoft.com/office/drawing/2014/chartex" xmlns:cx1="http://schemas.microsoft.com/office/drawing/2015/9/8/chartex" xmlns:cx2="http://schemas.microsoft.com/office/drawing/2015/10/21/chartex" xmlns:cx3="http://schemas.microsoft.com/office/drawing/2016/5/9/chartex" xmlns:cx4="http://schemas.microsoft.com/office/drawing/2016/5/10/chartex" xmlns:cx5="http://schemas.microsoft.com/office/drawing/2016/5/11/chartex" xmlns:cx6="http://schemas.microsoft.com/office/drawing/2016/5/12/chartex" xmlns:cx7="http://schemas.microsoft.com/office/drawing/2016/5/13/chartex" xmlns:cx8="http://schemas.microsoft.com/office/drawing/2016/5/14/chartex" xmlns:mc="http://schemas.openxmlformats.org/markup-compatibility/2006" xmlns:aink="http://schemas.microsoft.com/office/drawing/2016/ink" xmlns:am3d="http://schemas.microsoft.com/office/drawing/2017/model3d" xmlns:o="urn:schemas-microsoft-com:office:office" xmlns:oel="http://schemas.microsoft.com/office/2019/extlst" xmlns:r="http://schemas.openxmlformats.org/officeDocument/2006/relationships" xmlns:m="http://schemas.openxmlformats.org/officeDocument/2006/math" xmlns:v="urn:schemas-microsoft-com:vml" xmlns:wp14="http://schemas.microsoft.com/office/word/2010/wordprocessingDrawing" xmlns:wp="http://schemas.openxmlformats.org/drawingml/2006/wordprocessingDrawing" xmlns:w10="urn:schemas-microsoft-com:office:word" xmlns:w="http://schemas.openxmlformats.org/wordprocessingml/2006/main" xmlns:w14="http://schemas.microsoft.com/office/word/2010/wordml" xmlns:w15="http://schemas.microsoft.com/office/word/2012/wordml" xmlns:w16cex="http://schemas.microsoft.com/office/word/2018/wordml/cex" xmlns:w16cid="http://schemas.microsoft.com/office/word/2016/wordml/cid" xmlns:w16="http://schemas.microsoft.com/office/word/2018/wordml" xmlns:w16sdtdh="http://schemas.microsoft.com/office/word/2020/wordml/sdtdatahash" xmlns:w16se="http://schemas.microsoft.com/office/word/2015/wordml/symex" xmlns:wpg="http://schemas.microsoft.com/office/word/2010/wordprocessingGroup" xmlns:wpi="http://schemas.microsoft.com/office/word/2010/wordprocessingInk" xmlns:wne="http://schemas.microsoft.com/office/word/2006/wordml" xmlns:wps="http://schemas.microsoft.com/office/word/2010/wordprocessingShape" mc:Ignorable="w14 w15 w16se w16cid w16 w16cex w16sdtdh wp14">
+<w:document xmlns:wpc="http://schemas.microsoft.com/office/word/2010/wordprocessingCanvas" xmlns:cx="http://schemas.microsoft.com/office/drawing/2014/chartex" xmlns:cx1="http://schemas.microsoft.com/office/drawing/2015/9/8/chartex" xmlns:cx2="http://schemas.microsoft.com/office/drawing/2015/10/21/chartex" xmlns:cx3="http://schemas.microsoft.com/office/drawing/2016/5/9/chartex" xmlns:cx4="http://schemas.microsoft.com/office/drawing/2016/5/10/chartex" xmlns:cx5="http://schemas.microsoft.com/office/drawing/2016/5/11/chartex" xmlns:cx6="http://schemas.microsoft.com/office/drawing/2016/5/12/chartex" xmlns:cx7="http://schemas.microsoft.com/office/drawing/2016/5/13/chartex" xmlns:cx8="http://schemas.microsoft.com/office/drawing/2016/5/14/chartex" xmlns:mc="http://schemas.openxmlformats.org/markup-compatibility/2006" xmlns:aink="http://schemas.microsoft.com/office/drawing/2016/ink" xmlns:am3d="http://schemas.microsoft.com/office/drawing/2017/model3d" xmlns:o="urn:schemas-microsoft-com:office:office" xmlns:oel="http://schemas.microsoft.com/office/2019/extlst" xmlns:r="http://schemas.openxmlformats.org/officeDocument/2006/relationships" xmlns:m="http://schemas.openxmlformats.org/officeDocument/2006/math" xmlns:v="urn:schemas-microsoft-com:vml" xmlns:wp14="http://schemas.microsoft.com/office/word/2010/wordprocessingDrawing" xmlns:wp="http://schemas.openxmlformats.org/drawingml/2006/wordprocessingDrawing" xmlns:w10="urn:schemas-microsoft-com:office:word" xmlns:w="http://schemas.openxmlformats.org/wordprocessingml/2006/main" xmlns:w14="http://schemas.microsoft.com/office/word/2010/wordml" xmlns:w15="http://schemas.microsoft.com/office/word/2012/wordml" xmlns:w16cex="http://schemas.microsoft.com/office/word/2018/wordml/cex" xmlns:w16cid="http://schemas.microsoft.com/office/word/2016/wordml/cid" xmlns:w16="http://schemas.microsoft.com/office/word/2018/wordml" xmlns:w16du="http://schemas.microsoft.com/office/word/2023/wordml/word16du" xmlns:w16sdtdh="http://schemas.microsoft.com/office/word/2020/wordml/sdtdatahash" xmlns:w16sdtfl="http://schemas.microsoft.com/office/word/2024/wordml/sdtformatlock" xmlns:w16se="http://schemas.microsoft.com/office/word/2015/wordml/symex" xmlns:wpg="http://schemas.microsoft.com/office/word/2010/wordprocessingGroup" xmlns:wpi="http://schemas.microsoft.com/office/word/2010/wordprocessingInk" xmlns:wne="http://schemas.microsoft.com/office/word/2006/wordml" xmlns:wps="http://schemas.microsoft.com/office/word/2010/wordprocessingShape" mc:Ignorable="w14 w15 w16se w16cid w16 w16cex w16sdtdh w16sdtfl w16du wp14">
   <w:body>
     <w:p>
       <w:pPr>
@@ -34,16 +34,19 @@
           <w:szCs w:val="26"/>
         </w:rPr>
       </w:pPr>
-      <w:r>
-        <w:rPr>
-          <w:rFonts w:ascii="Times New Roman" w:hAnsi="Times New Roman" w:cs="Times New Roman"/>
-          <w:b/>
-          <w:bCs/>
-          <w:sz w:val="26"/>
-          <w:szCs w:val="26"/>
-        </w:rPr>
-        <w:t>https://youtu.be/LxeIwgqHfJA</w:t>
-      </w:r>
+      <w:hyperlink r:id="rId5" w:history="1">
+        <w:r>
+          <w:rPr>
+            <w:rStyle w:val="Hyperlink"/>
+            <w:rFonts w:ascii="Times New Roman" w:hAnsi="Times New Roman" w:cs="Times New Roman"/>
+            <w:b/>
+            <w:bCs/>
+            <w:sz w:val="26"/>
+            <w:szCs w:val="26"/>
+          </w:rPr>
+          <w:t>https://youtu.be/Ry9lrGw0WGM</w:t>
+        </w:r>
+      </w:hyperlink>
     </w:p>
     <w:p>
       <w:pPr>
@@ -165,7 +168,7 @@
                     <pic:cNvPicPr/>
                   </pic:nvPicPr>
                   <pic:blipFill>
-                    <a:blip r:embed="rId5">
+                    <a:blip r:embed="rId6">
                       <a:extLst>
                         <a:ext uri="{28A0092B-C50C-407E-A947-70E740481C1C}">
                           <a14:useLocalDpi xmlns:a14="http://schemas.microsoft.com/office/drawing/2010/main" val="0"/>
@@ -300,7 +303,7 @@
                     <pic:cNvPicPr/>
                   </pic:nvPicPr>
                   <pic:blipFill>
-                    <a:blip r:embed="rId6">
+                    <a:blip r:embed="rId7">
                       <a:extLst>
                         <a:ext uri="{28A0092B-C50C-407E-A947-70E740481C1C}">
                           <a14:useLocalDpi xmlns:a14="http://schemas.microsoft.com/office/drawing/2010/main" val="0"/>
@@ -414,7 +417,7 @@
                     <pic:cNvPicPr/>
                   </pic:nvPicPr>
                   <pic:blipFill>
-                    <a:blip r:embed="rId7">
+                    <a:blip r:embed="rId8">
                       <a:extLst>
                         <a:ext uri="{28A0092B-C50C-407E-A947-70E740481C1C}">
                           <a14:useLocalDpi xmlns:a14="http://schemas.microsoft.com/office/drawing/2010/main" val="0"/>
@@ -450,25 +453,14 @@
           <w:szCs w:val="26"/>
         </w:rPr>
       </w:pPr>
-      <w:proofErr w:type="spellStart"/>
-      <w:r>
-        <w:rPr>
-          <w:rFonts w:ascii="Times New Roman" w:hAnsi="Times New Roman" w:cs="Times New Roman"/>
-          <w:b/>
-          <w:sz w:val="26"/>
-          <w:szCs w:val="26"/>
-        </w:rPr>
-        <w:t>Cài</w:t>
-      </w:r>
-      <w:proofErr w:type="spellEnd"/>
-      <w:r>
-        <w:rPr>
-          <w:rFonts w:ascii="Times New Roman" w:hAnsi="Times New Roman" w:cs="Times New Roman"/>
-          <w:b/>
-          <w:sz w:val="26"/>
-          <w:szCs w:val="26"/>
-        </w:rPr>
-        <w:t xml:space="preserve"> </w:t>
+      <w:r>
+        <w:rPr>
+          <w:rFonts w:ascii="Times New Roman" w:hAnsi="Times New Roman" w:cs="Times New Roman"/>
+          <w:b/>
+          <w:sz w:val="26"/>
+          <w:szCs w:val="26"/>
+        </w:rPr>
+        <w:t xml:space="preserve">Cài </w:t>
       </w:r>
       <w:proofErr w:type="spellStart"/>
       <w:r>
@@ -542,7 +534,7 @@
                     <pic:cNvPicPr/>
                   </pic:nvPicPr>
                   <pic:blipFill>
-                    <a:blip r:embed="rId8">
+                    <a:blip r:embed="rId9">
                       <a:extLst>
                         <a:ext uri="{28A0092B-C50C-407E-A947-70E740481C1C}">
                           <a14:useLocalDpi xmlns:a14="http://schemas.microsoft.com/office/drawing/2010/main" val="0"/>
@@ -601,7 +593,7 @@
                     <pic:cNvPicPr/>
                   </pic:nvPicPr>
                   <pic:blipFill>
-                    <a:blip r:embed="rId9"/>
+                    <a:blip r:embed="rId10"/>
                     <a:stretch>
                       <a:fillRect/>
                     </a:stretch>
@@ -752,7 +744,7 @@
                     <pic:cNvPicPr/>
                   </pic:nvPicPr>
                   <pic:blipFill>
-                    <a:blip r:embed="rId10">
+                    <a:blip r:embed="rId11">
                       <a:extLst>
                         <a:ext uri="{28A0092B-C50C-407E-A947-70E740481C1C}">
                           <a14:useLocalDpi xmlns:a14="http://schemas.microsoft.com/office/drawing/2010/main" val="0"/>
@@ -983,7 +975,7 @@
                     <pic:cNvPicPr/>
                   </pic:nvPicPr>
                   <pic:blipFill>
-                    <a:blip r:embed="rId11">
+                    <a:blip r:embed="rId12">
                       <a:extLst>
                         <a:ext uri="{28A0092B-C50C-407E-A947-70E740481C1C}">
                           <a14:useLocalDpi xmlns:a14="http://schemas.microsoft.com/office/drawing/2010/main" val="0"/>
@@ -1041,7 +1033,7 @@
                     <pic:cNvPicPr/>
                   </pic:nvPicPr>
                   <pic:blipFill>
-                    <a:blip r:embed="rId12">
+                    <a:blip r:embed="rId13">
                       <a:extLst>
                         <a:ext uri="{28A0092B-C50C-407E-A947-70E740481C1C}">
                           <a14:useLocalDpi xmlns:a14="http://schemas.microsoft.com/office/drawing/2010/main" val="0"/>
@@ -1241,7 +1233,7 @@
                     <pic:cNvPicPr/>
                   </pic:nvPicPr>
                   <pic:blipFill>
-                    <a:blip r:embed="rId13">
+                    <a:blip r:embed="rId14">
                       <a:extLst>
                         <a:ext uri="{28A0092B-C50C-407E-A947-70E740481C1C}">
                           <a14:useLocalDpi xmlns:a14="http://schemas.microsoft.com/office/drawing/2010/main" val="0"/>
@@ -1428,7 +1420,7 @@
                     <pic:cNvPicPr/>
                   </pic:nvPicPr>
                   <pic:blipFill>
-                    <a:blip r:embed="rId14" cstate="print">
+                    <a:blip r:embed="rId15" cstate="print">
                       <a:extLst>
                         <a:ext uri="{28A0092B-C50C-407E-A947-70E740481C1C}">
                           <a14:useLocalDpi xmlns:a14="http://schemas.microsoft.com/office/drawing/2010/main" val="0"/>
@@ -1472,7 +1464,7 @@
         </w:rPr>
         <w:lastRenderedPageBreak/>
         <w:drawing>
-          <wp:inline distT="0" distB="0" distL="0" distR="0" wp14:anchorId="19232CE5" wp14:editId="28388A2C">
+          <wp:inline distT="0" distB="0" distL="0" distR="0" wp14:anchorId="19232CE5" wp14:editId="1268DF4E">
             <wp:extent cx="5943600" cy="4155440"/>
             <wp:effectExtent l="0" t="0" r="0" b="0"/>
             <wp:docPr id="15" name="Picture 15" descr="pfSense.home.arpa - Wizard: pfSense Setup: Configure LAN Interface - School - Microsoft​ Edge"/>
@@ -1484,195 +1476,6 @@
                 <pic:pic xmlns:pic="http://schemas.openxmlformats.org/drawingml/2006/picture">
                   <pic:nvPicPr>
                     <pic:cNvPr id="15" name="Picture 15" descr="pfSense.home.arpa - Wizard: pfSense Setup: Configure LAN Interface - School - Microsoft​ Edge"/>
-                    <pic:cNvPicPr/>
-                  </pic:nvPicPr>
-                  <pic:blipFill>
-                    <a:blip r:embed="rId15" cstate="print">
-                      <a:extLst>
-                        <a:ext uri="{28A0092B-C50C-407E-A947-70E740481C1C}">
-                          <a14:useLocalDpi xmlns:a14="http://schemas.microsoft.com/office/drawing/2010/main" val="0"/>
-                        </a:ext>
-                      </a:extLst>
-                    </a:blip>
-                    <a:stretch>
-                      <a:fillRect/>
-                    </a:stretch>
-                  </pic:blipFill>
-                  <pic:spPr>
-                    <a:xfrm>
-                      <a:off x="0" y="0"/>
-                      <a:ext cx="5943600" cy="4155440"/>
-                    </a:xfrm>
-                    <a:prstGeom prst="rect">
-                      <a:avLst/>
-                    </a:prstGeom>
-                  </pic:spPr>
-                </pic:pic>
-              </a:graphicData>
-            </a:graphic>
-          </wp:inline>
-        </w:drawing>
-      </w:r>
-    </w:p>
-    <w:p>
-      <w:pPr>
-        <w:rPr>
-          <w:rFonts w:ascii="Times New Roman" w:hAnsi="Times New Roman" w:cs="Times New Roman"/>
-          <w:b/>
-          <w:sz w:val="26"/>
-          <w:szCs w:val="26"/>
-        </w:rPr>
-      </w:pPr>
-      <w:proofErr w:type="spellStart"/>
-      <w:r>
-        <w:rPr>
-          <w:rFonts w:ascii="Times New Roman" w:hAnsi="Times New Roman" w:cs="Times New Roman"/>
-          <w:b/>
-          <w:sz w:val="26"/>
-          <w:szCs w:val="26"/>
-        </w:rPr>
-        <w:t>Kiểm</w:t>
-      </w:r>
-      <w:proofErr w:type="spellEnd"/>
-      <w:r>
-        <w:rPr>
-          <w:rFonts w:ascii="Times New Roman" w:hAnsi="Times New Roman" w:cs="Times New Roman"/>
-          <w:b/>
-          <w:sz w:val="26"/>
-          <w:szCs w:val="26"/>
-        </w:rPr>
-        <w:t xml:space="preserve"> </w:t>
-      </w:r>
-      <w:proofErr w:type="spellStart"/>
-      <w:r>
-        <w:rPr>
-          <w:rFonts w:ascii="Times New Roman" w:hAnsi="Times New Roman" w:cs="Times New Roman"/>
-          <w:b/>
-          <w:sz w:val="26"/>
-          <w:szCs w:val="26"/>
-        </w:rPr>
-        <w:t>tra</w:t>
-      </w:r>
-      <w:proofErr w:type="spellEnd"/>
-      <w:r>
-        <w:rPr>
-          <w:rFonts w:ascii="Times New Roman" w:hAnsi="Times New Roman" w:cs="Times New Roman"/>
-          <w:b/>
-          <w:sz w:val="26"/>
-          <w:szCs w:val="26"/>
-        </w:rPr>
-        <w:t xml:space="preserve"> Dashboard </w:t>
-      </w:r>
-      <w:proofErr w:type="spellStart"/>
-      <w:r>
-        <w:rPr>
-          <w:rFonts w:ascii="Times New Roman" w:hAnsi="Times New Roman" w:cs="Times New Roman"/>
-          <w:b/>
-          <w:sz w:val="26"/>
-          <w:szCs w:val="26"/>
-        </w:rPr>
-        <w:t>sau</w:t>
-      </w:r>
-      <w:proofErr w:type="spellEnd"/>
-      <w:r>
-        <w:rPr>
-          <w:rFonts w:ascii="Times New Roman" w:hAnsi="Times New Roman" w:cs="Times New Roman"/>
-          <w:b/>
-          <w:sz w:val="26"/>
-          <w:szCs w:val="26"/>
-        </w:rPr>
-        <w:t xml:space="preserve"> </w:t>
-      </w:r>
-      <w:proofErr w:type="spellStart"/>
-      <w:r>
-        <w:rPr>
-          <w:rFonts w:ascii="Times New Roman" w:hAnsi="Times New Roman" w:cs="Times New Roman"/>
-          <w:b/>
-          <w:sz w:val="26"/>
-          <w:szCs w:val="26"/>
-        </w:rPr>
-        <w:t>khi</w:t>
-      </w:r>
-      <w:proofErr w:type="spellEnd"/>
-      <w:r>
-        <w:rPr>
-          <w:rFonts w:ascii="Times New Roman" w:hAnsi="Times New Roman" w:cs="Times New Roman"/>
-          <w:b/>
-          <w:sz w:val="26"/>
-          <w:szCs w:val="26"/>
-        </w:rPr>
-        <w:t xml:space="preserve"> </w:t>
-      </w:r>
-      <w:proofErr w:type="spellStart"/>
-      <w:r>
-        <w:rPr>
-          <w:rFonts w:ascii="Times New Roman" w:hAnsi="Times New Roman" w:cs="Times New Roman"/>
-          <w:b/>
-          <w:sz w:val="26"/>
-          <w:szCs w:val="26"/>
-        </w:rPr>
-        <w:t>hoàn</w:t>
-      </w:r>
-      <w:proofErr w:type="spellEnd"/>
-      <w:r>
-        <w:rPr>
-          <w:rFonts w:ascii="Times New Roman" w:hAnsi="Times New Roman" w:cs="Times New Roman"/>
-          <w:b/>
-          <w:sz w:val="26"/>
-          <w:szCs w:val="26"/>
-        </w:rPr>
-        <w:t xml:space="preserve"> </w:t>
-      </w:r>
-      <w:proofErr w:type="spellStart"/>
-      <w:r>
-        <w:rPr>
-          <w:rFonts w:ascii="Times New Roman" w:hAnsi="Times New Roman" w:cs="Times New Roman"/>
-          <w:b/>
-          <w:sz w:val="26"/>
-          <w:szCs w:val="26"/>
-        </w:rPr>
-        <w:t>tất</w:t>
-      </w:r>
-      <w:proofErr w:type="spellEnd"/>
-      <w:r>
-        <w:rPr>
-          <w:rFonts w:ascii="Times New Roman" w:hAnsi="Times New Roman" w:cs="Times New Roman"/>
-          <w:b/>
-          <w:sz w:val="26"/>
-          <w:szCs w:val="26"/>
-        </w:rPr>
-        <w:t>.</w:t>
-      </w:r>
-    </w:p>
-    <w:p>
-      <w:pPr>
-        <w:rPr>
-          <w:rFonts w:ascii="Times New Roman" w:hAnsi="Times New Roman" w:cs="Times New Roman"/>
-          <w:sz w:val="26"/>
-          <w:szCs w:val="26"/>
-        </w:rPr>
-      </w:pPr>
-      <w:r>
-        <w:rPr>
-          <w:rFonts w:ascii="Times New Roman" w:hAnsi="Times New Roman" w:cs="Times New Roman"/>
-          <w:noProof/>
-          <w:sz w:val="26"/>
-          <w:szCs w:val="26"/>
-        </w:rPr>
-        <w:lastRenderedPageBreak/>
-        <w:drawing>
-          <wp:inline distT="0" distB="0" distL="0" distR="0" wp14:anchorId="5C831007" wp14:editId="5BEE5DD7">
-            <wp:extent cx="5943600" cy="4155440"/>
-            <wp:effectExtent l="0" t="0" r="0" b="0"/>
-            <wp:docPr id="17" name="Picture 17" descr="pfSense.home.arpa - Status: Dashboard - School - Microsoft​ Edge"/>
-            <wp:cNvGraphicFramePr>
-              <a:graphicFrameLocks xmlns:a="http://schemas.openxmlformats.org/drawingml/2006/main" noChangeAspect="1"/>
-            </wp:cNvGraphicFramePr>
-            <a:graphic xmlns:a="http://schemas.openxmlformats.org/drawingml/2006/main">
-              <a:graphicData uri="http://schemas.openxmlformats.org/drawingml/2006/picture">
-                <pic:pic xmlns:pic="http://schemas.openxmlformats.org/drawingml/2006/picture">
-                  <pic:nvPicPr>
-                    <pic:cNvPr id="17" name="Picture 17" descr="pfSense.home.arpa - Status: Dashboard - School - Microsoft​ Edge"/>
                     <pic:cNvPicPr/>
                   </pic:nvPicPr>
                   <pic:blipFill>
@@ -1712,25 +1515,15 @@
           <w:szCs w:val="26"/>
         </w:rPr>
       </w:pPr>
-      <w:bookmarkStart w:id="0" w:name="_Toc242090291"/>
-      <w:r>
-        <w:rPr>
-          <w:rFonts w:ascii="Times New Roman" w:hAnsi="Times New Roman" w:cs="Times New Roman"/>
-          <w:b/>
-          <w:sz w:val="26"/>
-          <w:szCs w:val="26"/>
-        </w:rPr>
-        <w:t xml:space="preserve">6. </w:t>
-      </w:r>
-      <w:proofErr w:type="spellStart"/>
-      <w:r>
-        <w:rPr>
-          <w:rFonts w:ascii="Times New Roman" w:hAnsi="Times New Roman" w:cs="Times New Roman"/>
-          <w:b/>
-          <w:sz w:val="26"/>
-          <w:szCs w:val="26"/>
-        </w:rPr>
-        <w:t>Cấu</w:t>
+      <w:proofErr w:type="spellStart"/>
+      <w:r>
+        <w:rPr>
+          <w:rFonts w:ascii="Times New Roman" w:hAnsi="Times New Roman" w:cs="Times New Roman"/>
+          <w:b/>
+          <w:sz w:val="26"/>
+          <w:szCs w:val="26"/>
+        </w:rPr>
+        <w:t>Kiểm</w:t>
       </w:r>
       <w:proofErr w:type="spellEnd"/>
       <w:r>
@@ -1750,7 +1543,27 @@
           <w:sz w:val="26"/>
           <w:szCs w:val="26"/>
         </w:rPr>
-        <w:t>hình</w:t>
+        <w:t>tra</w:t>
+      </w:r>
+      <w:proofErr w:type="spellEnd"/>
+      <w:r>
+        <w:rPr>
+          <w:rFonts w:ascii="Times New Roman" w:hAnsi="Times New Roman" w:cs="Times New Roman"/>
+          <w:b/>
+          <w:sz w:val="26"/>
+          <w:szCs w:val="26"/>
+        </w:rPr>
+        <w:t xml:space="preserve"> Dashboard </w:t>
+      </w:r>
+      <w:proofErr w:type="spellStart"/>
+      <w:r>
+        <w:rPr>
+          <w:rFonts w:ascii="Times New Roman" w:hAnsi="Times New Roman" w:cs="Times New Roman"/>
+          <w:b/>
+          <w:sz w:val="26"/>
+          <w:szCs w:val="26"/>
+        </w:rPr>
+        <w:t>sau</w:t>
       </w:r>
       <w:proofErr w:type="spellEnd"/>
       <w:r>
@@ -1770,143 +1583,63 @@
           <w:sz w:val="26"/>
           <w:szCs w:val="26"/>
         </w:rPr>
-        <w:t>vùng</w:t>
-      </w:r>
-      <w:proofErr w:type="spellEnd"/>
-      <w:r>
-        <w:rPr>
-          <w:rFonts w:ascii="Times New Roman" w:hAnsi="Times New Roman" w:cs="Times New Roman"/>
-          <w:b/>
-          <w:sz w:val="26"/>
-          <w:szCs w:val="26"/>
-        </w:rPr>
-        <w:t xml:space="preserve"> DMZ</w:t>
-      </w:r>
-      <w:bookmarkEnd w:id="0"/>
+        <w:t>khi</w:t>
+      </w:r>
+      <w:proofErr w:type="spellEnd"/>
+      <w:r>
+        <w:rPr>
+          <w:rFonts w:ascii="Times New Roman" w:hAnsi="Times New Roman" w:cs="Times New Roman"/>
+          <w:b/>
+          <w:sz w:val="26"/>
+          <w:szCs w:val="26"/>
+        </w:rPr>
+        <w:t xml:space="preserve"> </w:t>
+      </w:r>
+      <w:proofErr w:type="spellStart"/>
+      <w:r>
+        <w:rPr>
+          <w:rFonts w:ascii="Times New Roman" w:hAnsi="Times New Roman" w:cs="Times New Roman"/>
+          <w:b/>
+          <w:sz w:val="26"/>
+          <w:szCs w:val="26"/>
+        </w:rPr>
+        <w:t>hoàn</w:t>
+      </w:r>
+      <w:proofErr w:type="spellEnd"/>
+      <w:r>
+        <w:rPr>
+          <w:rFonts w:ascii="Times New Roman" w:hAnsi="Times New Roman" w:cs="Times New Roman"/>
+          <w:b/>
+          <w:sz w:val="26"/>
+          <w:szCs w:val="26"/>
+        </w:rPr>
+        <w:t xml:space="preserve"> </w:t>
+      </w:r>
+      <w:proofErr w:type="spellStart"/>
+      <w:r>
+        <w:rPr>
+          <w:rFonts w:ascii="Times New Roman" w:hAnsi="Times New Roman" w:cs="Times New Roman"/>
+          <w:b/>
+          <w:sz w:val="26"/>
+          <w:szCs w:val="26"/>
+        </w:rPr>
+        <w:t>tất</w:t>
+      </w:r>
+      <w:proofErr w:type="spellEnd"/>
+      <w:r>
+        <w:rPr>
+          <w:rFonts w:ascii="Times New Roman" w:hAnsi="Times New Roman" w:cs="Times New Roman"/>
+          <w:b/>
+          <w:sz w:val="26"/>
+          <w:szCs w:val="26"/>
+        </w:rPr>
+        <w:t>.</w:t>
+      </w:r>
     </w:p>
     <w:p>
       <w:pPr>
         <w:rPr>
           <w:rFonts w:ascii="Times New Roman" w:hAnsi="Times New Roman" w:cs="Times New Roman"/>
-          <w:b/>
-          <w:sz w:val="26"/>
-          <w:szCs w:val="26"/>
-        </w:rPr>
-      </w:pPr>
-      <w:proofErr w:type="spellStart"/>
-      <w:r>
-        <w:rPr>
-          <w:rFonts w:ascii="Times New Roman" w:hAnsi="Times New Roman" w:cs="Times New Roman"/>
-          <w:b/>
-          <w:sz w:val="26"/>
-          <w:szCs w:val="26"/>
-        </w:rPr>
-        <w:t>T</w:t>
-      </w:r>
-      <w:r>
-        <w:rPr>
-          <w:rFonts w:ascii="Times New Roman" w:hAnsi="Times New Roman" w:cs="Times New Roman"/>
-          <w:b/>
-          <w:sz w:val="26"/>
-          <w:szCs w:val="26"/>
-        </w:rPr>
-        <w:t>hêm</w:t>
-      </w:r>
-      <w:proofErr w:type="spellEnd"/>
-      <w:r>
-        <w:rPr>
-          <w:rFonts w:ascii="Times New Roman" w:hAnsi="Times New Roman" w:cs="Times New Roman"/>
-          <w:b/>
-          <w:sz w:val="26"/>
-          <w:szCs w:val="26"/>
-        </w:rPr>
-        <w:t xml:space="preserve"> card </w:t>
-      </w:r>
-      <w:proofErr w:type="spellStart"/>
-      <w:r>
-        <w:rPr>
-          <w:rFonts w:ascii="Times New Roman" w:hAnsi="Times New Roman" w:cs="Times New Roman"/>
-          <w:b/>
-          <w:sz w:val="26"/>
-          <w:szCs w:val="26"/>
-        </w:rPr>
-        <w:t>mạng</w:t>
-      </w:r>
-      <w:proofErr w:type="spellEnd"/>
-      <w:r>
-        <w:rPr>
-          <w:rFonts w:ascii="Times New Roman" w:hAnsi="Times New Roman" w:cs="Times New Roman"/>
-          <w:b/>
-          <w:sz w:val="26"/>
-          <w:szCs w:val="26"/>
-        </w:rPr>
-        <w:t xml:space="preserve"> </w:t>
-      </w:r>
-      <w:proofErr w:type="spellStart"/>
-      <w:r>
-        <w:rPr>
-          <w:rFonts w:ascii="Times New Roman" w:hAnsi="Times New Roman" w:cs="Times New Roman"/>
-          <w:b/>
-          <w:sz w:val="26"/>
-          <w:szCs w:val="26"/>
-        </w:rPr>
-        <w:t>thứ</w:t>
-      </w:r>
-      <w:proofErr w:type="spellEnd"/>
-      <w:r>
-        <w:rPr>
-          <w:rFonts w:ascii="Times New Roman" w:hAnsi="Times New Roman" w:cs="Times New Roman"/>
-          <w:b/>
-          <w:sz w:val="26"/>
-          <w:szCs w:val="26"/>
-        </w:rPr>
-        <w:t xml:space="preserve"> </w:t>
-      </w:r>
-      <w:proofErr w:type="spellStart"/>
-      <w:r>
-        <w:rPr>
-          <w:rFonts w:ascii="Times New Roman" w:hAnsi="Times New Roman" w:cs="Times New Roman"/>
-          <w:b/>
-          <w:sz w:val="26"/>
-          <w:szCs w:val="26"/>
-        </w:rPr>
-        <w:t>ba</w:t>
-      </w:r>
-      <w:proofErr w:type="spellEnd"/>
-      <w:r>
-        <w:rPr>
-          <w:rFonts w:ascii="Times New Roman" w:hAnsi="Times New Roman" w:cs="Times New Roman"/>
-          <w:b/>
-          <w:sz w:val="26"/>
-          <w:szCs w:val="26"/>
-        </w:rPr>
-        <w:t xml:space="preserve"> </w:t>
-      </w:r>
-      <w:proofErr w:type="spellStart"/>
-      <w:r>
-        <w:rPr>
-          <w:rFonts w:ascii="Times New Roman" w:hAnsi="Times New Roman" w:cs="Times New Roman"/>
-          <w:b/>
-          <w:sz w:val="26"/>
-          <w:szCs w:val="26"/>
-        </w:rPr>
-        <w:t>làm</w:t>
-      </w:r>
-      <w:proofErr w:type="spellEnd"/>
-      <w:r>
-        <w:rPr>
-          <w:rFonts w:ascii="Times New Roman" w:hAnsi="Times New Roman" w:cs="Times New Roman"/>
-          <w:b/>
-          <w:sz w:val="26"/>
-          <w:szCs w:val="26"/>
-        </w:rPr>
-        <w:t xml:space="preserve"> OPT1.</w:t>
-      </w:r>
-    </w:p>
-    <w:p>
-      <w:pPr>
-        <w:rPr>
-          <w:rFonts w:ascii="Times New Roman" w:hAnsi="Times New Roman" w:cs="Times New Roman"/>
           <w:sz w:val="26"/>
           <w:szCs w:val="26"/>
         </w:rPr>
@@ -1920,10 +1653,10 @@
         </w:rPr>
         <w:lastRenderedPageBreak/>
         <w:drawing>
-          <wp:inline distT="0" distB="0" distL="0" distR="0" wp14:anchorId="78F509D3" wp14:editId="43F85097">
+          <wp:inline distT="0" distB="0" distL="0" distR="0" wp14:anchorId="5C831007" wp14:editId="5BEE5DD7">
             <wp:extent cx="5943600" cy="4155440"/>
             <wp:effectExtent l="0" t="0" r="0" b="0"/>
-            <wp:docPr id="19" name="Picture 19" descr="pfSense.home.arpa - Interfaces: Interface Assignments - School - Microsoft​ Edge"/>
+            <wp:docPr id="17" name="Picture 17" descr="pfSense.home.arpa - Status: Dashboard - School - Microsoft​ Edge"/>
             <wp:cNvGraphicFramePr>
               <a:graphicFrameLocks xmlns:a="http://schemas.openxmlformats.org/drawingml/2006/main" noChangeAspect="1"/>
             </wp:cNvGraphicFramePr>
@@ -1931,7 +1664,7 @@
               <a:graphicData uri="http://schemas.openxmlformats.org/drawingml/2006/picture">
                 <pic:pic xmlns:pic="http://schemas.openxmlformats.org/drawingml/2006/picture">
                   <pic:nvPicPr>
-                    <pic:cNvPr id="19" name="Picture 19" descr="pfSense.home.arpa - Interfaces: Interface Assignments - School - Microsoft​ Edge"/>
+                    <pic:cNvPr id="17" name="Picture 17" descr="pfSense.home.arpa - Status: Dashboard - School - Microsoft​ Edge"/>
                     <pic:cNvPicPr/>
                   </pic:nvPicPr>
                   <pic:blipFill>
@@ -1967,6 +1700,265 @@
         <w:rPr>
           <w:rFonts w:ascii="Times New Roman" w:hAnsi="Times New Roman" w:cs="Times New Roman"/>
           <w:b/>
+          <w:sz w:val="26"/>
+          <w:szCs w:val="26"/>
+        </w:rPr>
+      </w:pPr>
+      <w:bookmarkStart w:id="0" w:name="_Toc242090291"/>
+      <w:r>
+        <w:rPr>
+          <w:rFonts w:ascii="Times New Roman" w:hAnsi="Times New Roman" w:cs="Times New Roman"/>
+          <w:b/>
+          <w:sz w:val="26"/>
+          <w:szCs w:val="26"/>
+        </w:rPr>
+        <w:t xml:space="preserve">6. </w:t>
+      </w:r>
+      <w:proofErr w:type="spellStart"/>
+      <w:r>
+        <w:rPr>
+          <w:rFonts w:ascii="Times New Roman" w:hAnsi="Times New Roman" w:cs="Times New Roman"/>
+          <w:b/>
+          <w:sz w:val="26"/>
+          <w:szCs w:val="26"/>
+        </w:rPr>
+        <w:t>Cấu</w:t>
+      </w:r>
+      <w:proofErr w:type="spellEnd"/>
+      <w:r>
+        <w:rPr>
+          <w:rFonts w:ascii="Times New Roman" w:hAnsi="Times New Roman" w:cs="Times New Roman"/>
+          <w:b/>
+          <w:sz w:val="26"/>
+          <w:szCs w:val="26"/>
+        </w:rPr>
+        <w:t xml:space="preserve"> </w:t>
+      </w:r>
+      <w:proofErr w:type="spellStart"/>
+      <w:r>
+        <w:rPr>
+          <w:rFonts w:ascii="Times New Roman" w:hAnsi="Times New Roman" w:cs="Times New Roman"/>
+          <w:b/>
+          <w:sz w:val="26"/>
+          <w:szCs w:val="26"/>
+        </w:rPr>
+        <w:t>hình</w:t>
+      </w:r>
+      <w:proofErr w:type="spellEnd"/>
+      <w:r>
+        <w:rPr>
+          <w:rFonts w:ascii="Times New Roman" w:hAnsi="Times New Roman" w:cs="Times New Roman"/>
+          <w:b/>
+          <w:sz w:val="26"/>
+          <w:szCs w:val="26"/>
+        </w:rPr>
+        <w:t xml:space="preserve"> </w:t>
+      </w:r>
+      <w:proofErr w:type="spellStart"/>
+      <w:r>
+        <w:rPr>
+          <w:rFonts w:ascii="Times New Roman" w:hAnsi="Times New Roman" w:cs="Times New Roman"/>
+          <w:b/>
+          <w:sz w:val="26"/>
+          <w:szCs w:val="26"/>
+        </w:rPr>
+        <w:t>vùng</w:t>
+      </w:r>
+      <w:proofErr w:type="spellEnd"/>
+      <w:r>
+        <w:rPr>
+          <w:rFonts w:ascii="Times New Roman" w:hAnsi="Times New Roman" w:cs="Times New Roman"/>
+          <w:b/>
+          <w:sz w:val="26"/>
+          <w:szCs w:val="26"/>
+        </w:rPr>
+        <w:t xml:space="preserve"> DMZ</w:t>
+      </w:r>
+      <w:bookmarkEnd w:id="0"/>
+    </w:p>
+    <w:p>
+      <w:pPr>
+        <w:rPr>
+          <w:rFonts w:ascii="Times New Roman" w:hAnsi="Times New Roman" w:cs="Times New Roman"/>
+          <w:b/>
+          <w:sz w:val="26"/>
+          <w:szCs w:val="26"/>
+        </w:rPr>
+      </w:pPr>
+      <w:proofErr w:type="spellStart"/>
+      <w:r>
+        <w:rPr>
+          <w:rFonts w:ascii="Times New Roman" w:hAnsi="Times New Roman" w:cs="Times New Roman"/>
+          <w:b/>
+          <w:sz w:val="26"/>
+          <w:szCs w:val="26"/>
+        </w:rPr>
+        <w:t>T</w:t>
+      </w:r>
+      <w:r>
+        <w:rPr>
+          <w:rFonts w:ascii="Times New Roman" w:hAnsi="Times New Roman" w:cs="Times New Roman"/>
+          <w:b/>
+          <w:sz w:val="26"/>
+          <w:szCs w:val="26"/>
+        </w:rPr>
+        <w:t>hêm</w:t>
+      </w:r>
+      <w:proofErr w:type="spellEnd"/>
+      <w:r>
+        <w:rPr>
+          <w:rFonts w:ascii="Times New Roman" w:hAnsi="Times New Roman" w:cs="Times New Roman"/>
+          <w:b/>
+          <w:sz w:val="26"/>
+          <w:szCs w:val="26"/>
+        </w:rPr>
+        <w:t xml:space="preserve"> card </w:t>
+      </w:r>
+      <w:proofErr w:type="spellStart"/>
+      <w:r>
+        <w:rPr>
+          <w:rFonts w:ascii="Times New Roman" w:hAnsi="Times New Roman" w:cs="Times New Roman"/>
+          <w:b/>
+          <w:sz w:val="26"/>
+          <w:szCs w:val="26"/>
+        </w:rPr>
+        <w:t>mạng</w:t>
+      </w:r>
+      <w:proofErr w:type="spellEnd"/>
+      <w:r>
+        <w:rPr>
+          <w:rFonts w:ascii="Times New Roman" w:hAnsi="Times New Roman" w:cs="Times New Roman"/>
+          <w:b/>
+          <w:sz w:val="26"/>
+          <w:szCs w:val="26"/>
+        </w:rPr>
+        <w:t xml:space="preserve"> </w:t>
+      </w:r>
+      <w:proofErr w:type="spellStart"/>
+      <w:r>
+        <w:rPr>
+          <w:rFonts w:ascii="Times New Roman" w:hAnsi="Times New Roman" w:cs="Times New Roman"/>
+          <w:b/>
+          <w:sz w:val="26"/>
+          <w:szCs w:val="26"/>
+        </w:rPr>
+        <w:t>thứ</w:t>
+      </w:r>
+      <w:proofErr w:type="spellEnd"/>
+      <w:r>
+        <w:rPr>
+          <w:rFonts w:ascii="Times New Roman" w:hAnsi="Times New Roman" w:cs="Times New Roman"/>
+          <w:b/>
+          <w:sz w:val="26"/>
+          <w:szCs w:val="26"/>
+        </w:rPr>
+        <w:t xml:space="preserve"> </w:t>
+      </w:r>
+      <w:proofErr w:type="spellStart"/>
+      <w:r>
+        <w:rPr>
+          <w:rFonts w:ascii="Times New Roman" w:hAnsi="Times New Roman" w:cs="Times New Roman"/>
+          <w:b/>
+          <w:sz w:val="26"/>
+          <w:szCs w:val="26"/>
+        </w:rPr>
+        <w:t>ba</w:t>
+      </w:r>
+      <w:proofErr w:type="spellEnd"/>
+      <w:r>
+        <w:rPr>
+          <w:rFonts w:ascii="Times New Roman" w:hAnsi="Times New Roman" w:cs="Times New Roman"/>
+          <w:b/>
+          <w:sz w:val="26"/>
+          <w:szCs w:val="26"/>
+        </w:rPr>
+        <w:t xml:space="preserve"> </w:t>
+      </w:r>
+      <w:proofErr w:type="spellStart"/>
+      <w:r>
+        <w:rPr>
+          <w:rFonts w:ascii="Times New Roman" w:hAnsi="Times New Roman" w:cs="Times New Roman"/>
+          <w:b/>
+          <w:sz w:val="26"/>
+          <w:szCs w:val="26"/>
+        </w:rPr>
+        <w:t>làm</w:t>
+      </w:r>
+      <w:proofErr w:type="spellEnd"/>
+      <w:r>
+        <w:rPr>
+          <w:rFonts w:ascii="Times New Roman" w:hAnsi="Times New Roman" w:cs="Times New Roman"/>
+          <w:b/>
+          <w:sz w:val="26"/>
+          <w:szCs w:val="26"/>
+        </w:rPr>
+        <w:t xml:space="preserve"> OPT1.</w:t>
+      </w:r>
+    </w:p>
+    <w:p>
+      <w:pPr>
+        <w:rPr>
+          <w:rFonts w:ascii="Times New Roman" w:hAnsi="Times New Roman" w:cs="Times New Roman"/>
+          <w:sz w:val="26"/>
+          <w:szCs w:val="26"/>
+        </w:rPr>
+      </w:pPr>
+      <w:r>
+        <w:rPr>
+          <w:rFonts w:ascii="Times New Roman" w:hAnsi="Times New Roman" w:cs="Times New Roman"/>
+          <w:noProof/>
+          <w:sz w:val="26"/>
+          <w:szCs w:val="26"/>
+        </w:rPr>
+        <w:lastRenderedPageBreak/>
+        <w:drawing>
+          <wp:inline distT="0" distB="0" distL="0" distR="0" wp14:anchorId="78F509D3" wp14:editId="2967E92B">
+            <wp:extent cx="5943600" cy="4155440"/>
+            <wp:effectExtent l="0" t="0" r="0" b="0"/>
+            <wp:docPr id="19" name="Picture 19" descr="pfSense.home.arpa - Interfaces: Interface Assignments - School - Microsoft​ Edge"/>
+            <wp:cNvGraphicFramePr>
+              <a:graphicFrameLocks xmlns:a="http://schemas.openxmlformats.org/drawingml/2006/main" noChangeAspect="1"/>
+            </wp:cNvGraphicFramePr>
+            <a:graphic xmlns:a="http://schemas.openxmlformats.org/drawingml/2006/main">
+              <a:graphicData uri="http://schemas.openxmlformats.org/drawingml/2006/picture">
+                <pic:pic xmlns:pic="http://schemas.openxmlformats.org/drawingml/2006/picture">
+                  <pic:nvPicPr>
+                    <pic:cNvPr id="19" name="Picture 19" descr="pfSense.home.arpa - Interfaces: Interface Assignments - School - Microsoft​ Edge"/>
+                    <pic:cNvPicPr/>
+                  </pic:nvPicPr>
+                  <pic:blipFill>
+                    <a:blip r:embed="rId18" cstate="print">
+                      <a:extLst>
+                        <a:ext uri="{28A0092B-C50C-407E-A947-70E740481C1C}">
+                          <a14:useLocalDpi xmlns:a14="http://schemas.microsoft.com/office/drawing/2010/main" val="0"/>
+                        </a:ext>
+                      </a:extLst>
+                    </a:blip>
+                    <a:stretch>
+                      <a:fillRect/>
+                    </a:stretch>
+                  </pic:blipFill>
+                  <pic:spPr>
+                    <a:xfrm>
+                      <a:off x="0" y="0"/>
+                      <a:ext cx="5943600" cy="4155440"/>
+                    </a:xfrm>
+                    <a:prstGeom prst="rect">
+                      <a:avLst/>
+                    </a:prstGeom>
+                  </pic:spPr>
+                </pic:pic>
+              </a:graphicData>
+            </a:graphic>
+          </wp:inline>
+        </w:drawing>
+      </w:r>
+    </w:p>
+    <w:p>
+      <w:pPr>
+        <w:rPr>
+          <w:rFonts w:ascii="Times New Roman" w:hAnsi="Times New Roman" w:cs="Times New Roman"/>
+          <w:b/>
           <w:bCs/>
           <w:sz w:val="26"/>
           <w:szCs w:val="26"/>
@@ -2136,7 +2128,7 @@
                     <pic:cNvPicPr/>
                   </pic:nvPicPr>
                   <pic:blipFill>
-                    <a:blip r:embed="rId18">
+                    <a:blip r:embed="rId19">
                       <a:extLst>
                         <a:ext uri="{28A0092B-C50C-407E-A947-70E740481C1C}">
                           <a14:useLocalDpi xmlns:a14="http://schemas.microsoft.com/office/drawing/2010/main" val="0"/>
@@ -2589,7 +2581,7 @@
                     <pic:cNvPicPr/>
                   </pic:nvPicPr>
                   <pic:blipFill>
-                    <a:blip r:embed="rId19">
+                    <a:blip r:embed="rId20">
                       <a:extLst>
                         <a:ext uri="{28A0092B-C50C-407E-A947-70E740481C1C}">
                           <a14:useLocalDpi xmlns:a14="http://schemas.microsoft.com/office/drawing/2010/main" val="0"/>
@@ -2647,7 +2639,7 @@
                     <pic:cNvPicPr/>
                   </pic:nvPicPr>
                   <pic:blipFill>
-                    <a:blip r:embed="rId20">
+                    <a:blip r:embed="rId21">
                       <a:extLst>
                         <a:ext uri="{28A0092B-C50C-407E-A947-70E740481C1C}">
                           <a14:useLocalDpi xmlns:a14="http://schemas.microsoft.com/office/drawing/2010/main" val="0"/>
@@ -2790,7 +2782,7 @@
         </w:rPr>
         <w:lastRenderedPageBreak/>
         <w:drawing>
-          <wp:inline distT="0" distB="0" distL="0" distR="0" wp14:anchorId="1309FFE8" wp14:editId="105264F9">
+          <wp:inline distT="0" distB="0" distL="0" distR="0" wp14:anchorId="1309FFE8" wp14:editId="128C3F5F">
             <wp:extent cx="5943600" cy="4161790"/>
             <wp:effectExtent l="0" t="0" r="0" b="0"/>
             <wp:docPr id="16" name="Picture 16" descr="pfSense.home.arpa - Firewall: NAT: Outbound - School - Microsoft​ Edge"/>
@@ -2802,198 +2794,6 @@
                 <pic:pic xmlns:pic="http://schemas.openxmlformats.org/drawingml/2006/picture">
                   <pic:nvPicPr>
                     <pic:cNvPr id="16" name="Picture 16" descr="pfSense.home.arpa - Firewall: NAT: Outbound - School - Microsoft​ Edge"/>
-                    <pic:cNvPicPr/>
-                  </pic:nvPicPr>
-                  <pic:blipFill>
-                    <a:blip r:embed="rId21" cstate="print">
-                      <a:extLst>
-                        <a:ext uri="{28A0092B-C50C-407E-A947-70E740481C1C}">
-                          <a14:useLocalDpi xmlns:a14="http://schemas.microsoft.com/office/drawing/2010/main" val="0"/>
-                        </a:ext>
-                      </a:extLst>
-                    </a:blip>
-                    <a:stretch>
-                      <a:fillRect/>
-                    </a:stretch>
-                  </pic:blipFill>
-                  <pic:spPr>
-                    <a:xfrm>
-                      <a:off x="0" y="0"/>
-                      <a:ext cx="5943600" cy="4161790"/>
-                    </a:xfrm>
-                    <a:prstGeom prst="rect">
-                      <a:avLst/>
-                    </a:prstGeom>
-                  </pic:spPr>
-                </pic:pic>
-              </a:graphicData>
-            </a:graphic>
-          </wp:inline>
-        </w:drawing>
-      </w:r>
-    </w:p>
-    <w:p>
-      <w:pPr>
-        <w:rPr>
-          <w:rFonts w:ascii="Times New Roman" w:hAnsi="Times New Roman" w:cs="Times New Roman"/>
-          <w:b/>
-          <w:bCs/>
-          <w:sz w:val="26"/>
-          <w:szCs w:val="26"/>
-        </w:rPr>
-      </w:pPr>
-      <w:proofErr w:type="spellStart"/>
-      <w:r>
-        <w:rPr>
-          <w:rFonts w:ascii="Times New Roman" w:hAnsi="Times New Roman" w:cs="Times New Roman"/>
-          <w:b/>
-          <w:bCs/>
-          <w:sz w:val="26"/>
-          <w:szCs w:val="26"/>
-        </w:rPr>
-        <w:t>Chuẩn</w:t>
-      </w:r>
-      <w:proofErr w:type="spellEnd"/>
-      <w:r>
-        <w:rPr>
-          <w:rFonts w:ascii="Times New Roman" w:hAnsi="Times New Roman" w:cs="Times New Roman"/>
-          <w:b/>
-          <w:bCs/>
-          <w:sz w:val="26"/>
-          <w:szCs w:val="26"/>
-        </w:rPr>
-        <w:t xml:space="preserve"> </w:t>
-      </w:r>
-      <w:proofErr w:type="spellStart"/>
-      <w:r>
-        <w:rPr>
-          <w:rFonts w:ascii="Times New Roman" w:hAnsi="Times New Roman" w:cs="Times New Roman"/>
-          <w:b/>
-          <w:bCs/>
-          <w:sz w:val="26"/>
-          <w:szCs w:val="26"/>
-        </w:rPr>
-        <w:t>hóa</w:t>
-      </w:r>
-      <w:proofErr w:type="spellEnd"/>
-      <w:r>
-        <w:rPr>
-          <w:rFonts w:ascii="Times New Roman" w:hAnsi="Times New Roman" w:cs="Times New Roman"/>
-          <w:b/>
-          <w:bCs/>
-          <w:sz w:val="26"/>
-          <w:szCs w:val="26"/>
-        </w:rPr>
-        <w:t xml:space="preserve"> ruleset LAN </w:t>
-      </w:r>
-      <w:proofErr w:type="spellStart"/>
-      <w:r>
-        <w:rPr>
-          <w:rFonts w:ascii="Times New Roman" w:hAnsi="Times New Roman" w:cs="Times New Roman"/>
-          <w:b/>
-          <w:bCs/>
-          <w:sz w:val="26"/>
-          <w:szCs w:val="26"/>
-        </w:rPr>
-        <w:t>và</w:t>
-      </w:r>
-      <w:proofErr w:type="spellEnd"/>
-      <w:r>
-        <w:rPr>
-          <w:rFonts w:ascii="Times New Roman" w:hAnsi="Times New Roman" w:cs="Times New Roman"/>
-          <w:b/>
-          <w:bCs/>
-          <w:sz w:val="26"/>
-          <w:szCs w:val="26"/>
-        </w:rPr>
-        <w:t xml:space="preserve"> </w:t>
-      </w:r>
-      <w:proofErr w:type="spellStart"/>
-      <w:r>
-        <w:rPr>
-          <w:rFonts w:ascii="Times New Roman" w:hAnsi="Times New Roman" w:cs="Times New Roman"/>
-          <w:b/>
-          <w:bCs/>
-          <w:sz w:val="26"/>
-          <w:szCs w:val="26"/>
-        </w:rPr>
-        <w:t>tạo</w:t>
-      </w:r>
-      <w:proofErr w:type="spellEnd"/>
-      <w:r>
-        <w:rPr>
-          <w:rFonts w:ascii="Times New Roman" w:hAnsi="Times New Roman" w:cs="Times New Roman"/>
-          <w:b/>
-          <w:bCs/>
-          <w:sz w:val="26"/>
-          <w:szCs w:val="26"/>
-        </w:rPr>
-        <w:t xml:space="preserve"> rule </w:t>
-      </w:r>
-      <w:proofErr w:type="spellStart"/>
-      <w:r>
-        <w:rPr>
-          <w:rFonts w:ascii="Times New Roman" w:hAnsi="Times New Roman" w:cs="Times New Roman"/>
-          <w:b/>
-          <w:bCs/>
-          <w:sz w:val="26"/>
-          <w:szCs w:val="26"/>
-        </w:rPr>
-        <w:t>nền</w:t>
-      </w:r>
-      <w:proofErr w:type="spellEnd"/>
-      <w:r>
-        <w:rPr>
-          <w:rFonts w:ascii="Times New Roman" w:hAnsi="Times New Roman" w:cs="Times New Roman"/>
-          <w:b/>
-          <w:bCs/>
-          <w:sz w:val="26"/>
-          <w:szCs w:val="26"/>
-        </w:rPr>
-        <w:t xml:space="preserve"> </w:t>
-      </w:r>
-      <w:proofErr w:type="spellStart"/>
-      <w:r>
-        <w:rPr>
-          <w:rFonts w:ascii="Times New Roman" w:hAnsi="Times New Roman" w:cs="Times New Roman"/>
-          <w:b/>
-          <w:bCs/>
-          <w:sz w:val="26"/>
-          <w:szCs w:val="26"/>
-        </w:rPr>
-        <w:t>tảng</w:t>
-      </w:r>
-      <w:proofErr w:type="spellEnd"/>
-    </w:p>
-    <w:p>
-      <w:pPr>
-        <w:rPr>
-          <w:rFonts w:ascii="Times New Roman" w:hAnsi="Times New Roman" w:cs="Times New Roman"/>
-          <w:sz w:val="26"/>
-          <w:szCs w:val="26"/>
-        </w:rPr>
-      </w:pPr>
-      <w:r>
-        <w:rPr>
-          <w:rFonts w:ascii="Times New Roman" w:hAnsi="Times New Roman" w:cs="Times New Roman"/>
-          <w:noProof/>
-          <w:sz w:val="26"/>
-          <w:szCs w:val="26"/>
-        </w:rPr>
-        <w:lastRenderedPageBreak/>
-        <w:drawing>
-          <wp:inline distT="0" distB="0" distL="0" distR="0" wp14:anchorId="4FB07A12" wp14:editId="5617E3D3">
-            <wp:extent cx="5943600" cy="4161790"/>
-            <wp:effectExtent l="0" t="0" r="0" b="0"/>
-            <wp:docPr id="18" name="Picture 18" descr="pfSense.home.arpa - Firewall: Rules: LAN - School - Microsoft​ Edge"/>
-            <wp:cNvGraphicFramePr>
-              <a:graphicFrameLocks xmlns:a="http://schemas.openxmlformats.org/drawingml/2006/main" noChangeAspect="1"/>
-            </wp:cNvGraphicFramePr>
-            <a:graphic xmlns:a="http://schemas.openxmlformats.org/drawingml/2006/main">
-              <a:graphicData uri="http://schemas.openxmlformats.org/drawingml/2006/picture">
-                <pic:pic xmlns:pic="http://schemas.openxmlformats.org/drawingml/2006/picture">
-                  <pic:nvPicPr>
-                    <pic:cNvPr id="18" name="Picture 18" descr="pfSense.home.arpa - Firewall: Rules: LAN - School - Microsoft​ Edge"/>
                     <pic:cNvPicPr/>
                   </pic:nvPicPr>
                   <pic:blipFill>
@@ -3028,36 +2828,156 @@
       <w:pPr>
         <w:rPr>
           <w:rFonts w:ascii="Times New Roman" w:hAnsi="Times New Roman" w:cs="Times New Roman"/>
-          <w:sz w:val="26"/>
-          <w:szCs w:val="26"/>
-        </w:rPr>
-      </w:pPr>
+          <w:b/>
+          <w:bCs/>
+          <w:sz w:val="26"/>
+          <w:szCs w:val="26"/>
+        </w:rPr>
+      </w:pPr>
+      <w:proofErr w:type="spellStart"/>
+      <w:r>
+        <w:rPr>
+          <w:rFonts w:ascii="Times New Roman" w:hAnsi="Times New Roman" w:cs="Times New Roman"/>
+          <w:b/>
+          <w:bCs/>
+          <w:sz w:val="26"/>
+          <w:szCs w:val="26"/>
+        </w:rPr>
+        <w:t>Chuẩn</w:t>
+      </w:r>
+      <w:proofErr w:type="spellEnd"/>
+      <w:r>
+        <w:rPr>
+          <w:rFonts w:ascii="Times New Roman" w:hAnsi="Times New Roman" w:cs="Times New Roman"/>
+          <w:b/>
+          <w:bCs/>
+          <w:sz w:val="26"/>
+          <w:szCs w:val="26"/>
+        </w:rPr>
+        <w:t xml:space="preserve"> </w:t>
+      </w:r>
+      <w:proofErr w:type="spellStart"/>
+      <w:r>
+        <w:rPr>
+          <w:rFonts w:ascii="Times New Roman" w:hAnsi="Times New Roman" w:cs="Times New Roman"/>
+          <w:b/>
+          <w:bCs/>
+          <w:sz w:val="26"/>
+          <w:szCs w:val="26"/>
+        </w:rPr>
+        <w:t>hóa</w:t>
+      </w:r>
+      <w:proofErr w:type="spellEnd"/>
+      <w:r>
+        <w:rPr>
+          <w:rFonts w:ascii="Times New Roman" w:hAnsi="Times New Roman" w:cs="Times New Roman"/>
+          <w:b/>
+          <w:bCs/>
+          <w:sz w:val="26"/>
+          <w:szCs w:val="26"/>
+        </w:rPr>
+        <w:t xml:space="preserve"> ruleset LAN </w:t>
+      </w:r>
+      <w:proofErr w:type="spellStart"/>
+      <w:r>
+        <w:rPr>
+          <w:rFonts w:ascii="Times New Roman" w:hAnsi="Times New Roman" w:cs="Times New Roman"/>
+          <w:b/>
+          <w:bCs/>
+          <w:sz w:val="26"/>
+          <w:szCs w:val="26"/>
+        </w:rPr>
+        <w:t>và</w:t>
+      </w:r>
+      <w:proofErr w:type="spellEnd"/>
+      <w:r>
+        <w:rPr>
+          <w:rFonts w:ascii="Times New Roman" w:hAnsi="Times New Roman" w:cs="Times New Roman"/>
+          <w:b/>
+          <w:bCs/>
+          <w:sz w:val="26"/>
+          <w:szCs w:val="26"/>
+        </w:rPr>
+        <w:t xml:space="preserve"> </w:t>
+      </w:r>
+      <w:proofErr w:type="spellStart"/>
+      <w:r>
+        <w:rPr>
+          <w:rFonts w:ascii="Times New Roman" w:hAnsi="Times New Roman" w:cs="Times New Roman"/>
+          <w:b/>
+          <w:bCs/>
+          <w:sz w:val="26"/>
+          <w:szCs w:val="26"/>
+        </w:rPr>
+        <w:t>tạo</w:t>
+      </w:r>
+      <w:proofErr w:type="spellEnd"/>
+      <w:r>
+        <w:rPr>
+          <w:rFonts w:ascii="Times New Roman" w:hAnsi="Times New Roman" w:cs="Times New Roman"/>
+          <w:b/>
+          <w:bCs/>
+          <w:sz w:val="26"/>
+          <w:szCs w:val="26"/>
+        </w:rPr>
+        <w:t xml:space="preserve"> rule </w:t>
+      </w:r>
+      <w:proofErr w:type="spellStart"/>
+      <w:r>
+        <w:rPr>
+          <w:rFonts w:ascii="Times New Roman" w:hAnsi="Times New Roman" w:cs="Times New Roman"/>
+          <w:b/>
+          <w:bCs/>
+          <w:sz w:val="26"/>
+          <w:szCs w:val="26"/>
+        </w:rPr>
+        <w:t>nền</w:t>
+      </w:r>
+      <w:proofErr w:type="spellEnd"/>
+      <w:r>
+        <w:rPr>
+          <w:rFonts w:ascii="Times New Roman" w:hAnsi="Times New Roman" w:cs="Times New Roman"/>
+          <w:b/>
+          <w:bCs/>
+          <w:sz w:val="26"/>
+          <w:szCs w:val="26"/>
+        </w:rPr>
+        <w:t xml:space="preserve"> </w:t>
+      </w:r>
+      <w:proofErr w:type="spellStart"/>
+      <w:r>
+        <w:rPr>
+          <w:rFonts w:ascii="Times New Roman" w:hAnsi="Times New Roman" w:cs="Times New Roman"/>
+          <w:b/>
+          <w:bCs/>
+          <w:sz w:val="26"/>
+          <w:szCs w:val="26"/>
+        </w:rPr>
+        <w:t>tảng</w:t>
+      </w:r>
+      <w:proofErr w:type="spellEnd"/>
     </w:p>
     <w:p>
       <w:pPr>
         <w:rPr>
           <w:rFonts w:ascii="Times New Roman" w:hAnsi="Times New Roman" w:cs="Times New Roman"/>
-          <w:b/>
-          <w:bCs/>
-          <w:sz w:val="26"/>
-          <w:szCs w:val="26"/>
-        </w:rPr>
-      </w:pPr>
-      <w:r>
-        <w:rPr>
-          <w:rFonts w:ascii="Times New Roman" w:hAnsi="Times New Roman" w:cs="Times New Roman"/>
-          <w:b/>
-          <w:bCs/>
+          <w:sz w:val="26"/>
+          <w:szCs w:val="26"/>
+        </w:rPr>
+      </w:pPr>
+      <w:r>
+        <w:rPr>
+          <w:rFonts w:ascii="Times New Roman" w:hAnsi="Times New Roman" w:cs="Times New Roman"/>
           <w:noProof/>
           <w:sz w:val="26"/>
           <w:szCs w:val="26"/>
         </w:rPr>
         <w:lastRenderedPageBreak/>
         <w:drawing>
-          <wp:inline distT="0" distB="0" distL="0" distR="0" wp14:anchorId="6E2210CE" wp14:editId="4277FDDA">
+          <wp:inline distT="0" distB="0" distL="0" distR="0" wp14:anchorId="4FB07A12" wp14:editId="5617E3D3">
             <wp:extent cx="5943600" cy="4161790"/>
             <wp:effectExtent l="0" t="0" r="0" b="0"/>
-            <wp:docPr id="21" name="Picture 21" descr="pfSense.home.arpa - Diagnostics: States: Reset States - School - Microsoft​ Edge"/>
+            <wp:docPr id="18" name="Picture 18" descr="pfSense.home.arpa - Firewall: Rules: LAN - School - Microsoft​ Edge"/>
             <wp:cNvGraphicFramePr>
               <a:graphicFrameLocks xmlns:a="http://schemas.openxmlformats.org/drawingml/2006/main" noChangeAspect="1"/>
             </wp:cNvGraphicFramePr>
@@ -3065,7 +2985,7 @@
               <a:graphicData uri="http://schemas.openxmlformats.org/drawingml/2006/picture">
                 <pic:pic xmlns:pic="http://schemas.openxmlformats.org/drawingml/2006/picture">
                   <pic:nvPicPr>
-                    <pic:cNvPr id="21" name="Picture 21" descr="pfSense.home.arpa - Diagnostics: States: Reset States - School - Microsoft​ Edge"/>
+                    <pic:cNvPr id="18" name="Picture 18" descr="pfSense.home.arpa - Firewall: Rules: LAN - School - Microsoft​ Edge"/>
                     <pic:cNvPicPr/>
                   </pic:nvPicPr>
                   <pic:blipFill>
@@ -3100,166 +3020,10 @@
       <w:pPr>
         <w:rPr>
           <w:rFonts w:ascii="Times New Roman" w:hAnsi="Times New Roman" w:cs="Times New Roman"/>
-          <w:b/>
-          <w:bCs/>
-          <w:sz w:val="26"/>
-          <w:szCs w:val="26"/>
-        </w:rPr>
-      </w:pPr>
-      <w:proofErr w:type="spellStart"/>
-      <w:r>
-        <w:rPr>
-          <w:rFonts w:ascii="Times New Roman" w:hAnsi="Times New Roman" w:cs="Times New Roman"/>
-          <w:b/>
-          <w:bCs/>
-          <w:sz w:val="26"/>
-          <w:szCs w:val="26"/>
-        </w:rPr>
-        <w:t>Kiểm</w:t>
-      </w:r>
-      <w:proofErr w:type="spellEnd"/>
-      <w:r>
-        <w:rPr>
-          <w:rFonts w:ascii="Times New Roman" w:hAnsi="Times New Roman" w:cs="Times New Roman"/>
-          <w:b/>
-          <w:bCs/>
-          <w:sz w:val="26"/>
-          <w:szCs w:val="26"/>
-        </w:rPr>
-        <w:t xml:space="preserve"> </w:t>
-      </w:r>
-      <w:proofErr w:type="spellStart"/>
-      <w:r>
-        <w:rPr>
-          <w:rFonts w:ascii="Times New Roman" w:hAnsi="Times New Roman" w:cs="Times New Roman"/>
-          <w:b/>
-          <w:bCs/>
-          <w:sz w:val="26"/>
-          <w:szCs w:val="26"/>
-        </w:rPr>
-        <w:t>tra</w:t>
-      </w:r>
-      <w:proofErr w:type="spellEnd"/>
-      <w:r>
-        <w:rPr>
-          <w:rFonts w:ascii="Times New Roman" w:hAnsi="Times New Roman" w:cs="Times New Roman"/>
-          <w:b/>
-          <w:bCs/>
-          <w:sz w:val="26"/>
-          <w:szCs w:val="26"/>
-        </w:rPr>
-        <w:t xml:space="preserve"> </w:t>
-      </w:r>
-      <w:proofErr w:type="spellStart"/>
-      <w:r>
-        <w:rPr>
-          <w:rFonts w:ascii="Times New Roman" w:hAnsi="Times New Roman" w:cs="Times New Roman"/>
-          <w:b/>
-          <w:bCs/>
-          <w:sz w:val="26"/>
-          <w:szCs w:val="26"/>
-        </w:rPr>
-        <w:t>đường</w:t>
-      </w:r>
-      <w:proofErr w:type="spellEnd"/>
-      <w:r>
-        <w:rPr>
-          <w:rFonts w:ascii="Times New Roman" w:hAnsi="Times New Roman" w:cs="Times New Roman"/>
-          <w:b/>
-          <w:bCs/>
-          <w:sz w:val="26"/>
-          <w:szCs w:val="26"/>
-        </w:rPr>
-        <w:t xml:space="preserve"> WAN/DNS </w:t>
-      </w:r>
-      <w:proofErr w:type="spellStart"/>
-      <w:r>
-        <w:rPr>
-          <w:rFonts w:ascii="Times New Roman" w:hAnsi="Times New Roman" w:cs="Times New Roman"/>
-          <w:b/>
-          <w:bCs/>
-          <w:sz w:val="26"/>
-          <w:szCs w:val="26"/>
-        </w:rPr>
-        <w:t>của</w:t>
-      </w:r>
-      <w:proofErr w:type="spellEnd"/>
-      <w:r>
-        <w:rPr>
-          <w:rFonts w:ascii="Times New Roman" w:hAnsi="Times New Roman" w:cs="Times New Roman"/>
-          <w:b/>
-          <w:bCs/>
-          <w:sz w:val="26"/>
-          <w:szCs w:val="26"/>
-        </w:rPr>
-        <w:t xml:space="preserve"> </w:t>
-      </w:r>
-      <w:proofErr w:type="spellStart"/>
-      <w:r>
-        <w:rPr>
-          <w:rFonts w:ascii="Times New Roman" w:hAnsi="Times New Roman" w:cs="Times New Roman"/>
-          <w:b/>
-          <w:bCs/>
-          <w:sz w:val="26"/>
-          <w:szCs w:val="26"/>
-        </w:rPr>
-        <w:t>chính</w:t>
-      </w:r>
-      <w:proofErr w:type="spellEnd"/>
-      <w:r>
-        <w:rPr>
-          <w:rFonts w:ascii="Times New Roman" w:hAnsi="Times New Roman" w:cs="Times New Roman"/>
-          <w:b/>
-          <w:bCs/>
-          <w:sz w:val="26"/>
-          <w:szCs w:val="26"/>
-        </w:rPr>
-        <w:t xml:space="preserve"> </w:t>
-      </w:r>
-      <w:proofErr w:type="spellStart"/>
-      <w:r>
-        <w:rPr>
-          <w:rFonts w:ascii="Times New Roman" w:hAnsi="Times New Roman" w:cs="Times New Roman"/>
-          <w:b/>
-          <w:bCs/>
-          <w:sz w:val="26"/>
-          <w:szCs w:val="26"/>
-        </w:rPr>
-        <w:t>pfSense</w:t>
-      </w:r>
-      <w:proofErr w:type="spellEnd"/>
-      <w:r>
-        <w:rPr>
-          <w:rFonts w:ascii="Times New Roman" w:hAnsi="Times New Roman" w:cs="Times New Roman"/>
-          <w:b/>
-          <w:bCs/>
-          <w:sz w:val="26"/>
-          <w:szCs w:val="26"/>
-        </w:rPr>
-        <w:t xml:space="preserve"> </w:t>
-      </w:r>
-      <w:proofErr w:type="spellStart"/>
-      <w:r>
-        <w:rPr>
-          <w:rFonts w:ascii="Times New Roman" w:hAnsi="Times New Roman" w:cs="Times New Roman"/>
-          <w:b/>
-          <w:bCs/>
-          <w:sz w:val="26"/>
-          <w:szCs w:val="26"/>
-        </w:rPr>
-        <w:t>bằng</w:t>
-      </w:r>
-      <w:proofErr w:type="spellEnd"/>
-      <w:r>
-        <w:rPr>
-          <w:rFonts w:ascii="Times New Roman" w:hAnsi="Times New Roman" w:cs="Times New Roman"/>
-          <w:b/>
-          <w:bCs/>
-          <w:sz w:val="26"/>
-          <w:szCs w:val="26"/>
-        </w:rPr>
-        <w:t xml:space="preserve"> Diagnostics</w:t>
-      </w:r>
+          <w:sz w:val="26"/>
+          <w:szCs w:val="26"/>
+        </w:rPr>
+      </w:pPr>
     </w:p>
     <w:p>
       <w:pPr>
@@ -3282,10 +3046,10 @@
         </w:rPr>
         <w:lastRenderedPageBreak/>
         <w:drawing>
-          <wp:inline distT="0" distB="0" distL="0" distR="0" wp14:anchorId="75818D27" wp14:editId="314BC2AC">
+          <wp:inline distT="0" distB="0" distL="0" distR="0" wp14:anchorId="6E2210CE" wp14:editId="7992DF44">
             <wp:extent cx="5943600" cy="4161790"/>
             <wp:effectExtent l="0" t="0" r="0" b="0"/>
-            <wp:docPr id="22" name="Picture 22" descr="pfSense.home.arpa - Diagnostics: Ping - School - Microsoft​ Edge"/>
+            <wp:docPr id="21" name="Picture 21" descr="pfSense.home.arpa - Diagnostics: States: Reset States - School - Microsoft​ Edge"/>
             <wp:cNvGraphicFramePr>
               <a:graphicFrameLocks xmlns:a="http://schemas.openxmlformats.org/drawingml/2006/main" noChangeAspect="1"/>
             </wp:cNvGraphicFramePr>
@@ -3293,7 +3057,7 @@
               <a:graphicData uri="http://schemas.openxmlformats.org/drawingml/2006/picture">
                 <pic:pic xmlns:pic="http://schemas.openxmlformats.org/drawingml/2006/picture">
                   <pic:nvPicPr>
-                    <pic:cNvPr id="22" name="Picture 22" descr="pfSense.home.arpa - Diagnostics: Ping - School - Microsoft​ Edge"/>
+                    <pic:cNvPr id="21" name="Picture 21" descr="pfSense.home.arpa - Diagnostics: States: Reset States - School - Microsoft​ Edge"/>
                     <pic:cNvPicPr/>
                   </pic:nvPicPr>
                   <pic:blipFill>
@@ -3334,6 +3098,234 @@
           <w:szCs w:val="26"/>
         </w:rPr>
       </w:pPr>
+      <w:proofErr w:type="spellStart"/>
+      <w:r>
+        <w:rPr>
+          <w:rFonts w:ascii="Times New Roman" w:hAnsi="Times New Roman" w:cs="Times New Roman"/>
+          <w:b/>
+          <w:bCs/>
+          <w:sz w:val="26"/>
+          <w:szCs w:val="26"/>
+        </w:rPr>
+        <w:t>Kiểm</w:t>
+      </w:r>
+      <w:proofErr w:type="spellEnd"/>
+      <w:r>
+        <w:rPr>
+          <w:rFonts w:ascii="Times New Roman" w:hAnsi="Times New Roman" w:cs="Times New Roman"/>
+          <w:b/>
+          <w:bCs/>
+          <w:sz w:val="26"/>
+          <w:szCs w:val="26"/>
+        </w:rPr>
+        <w:t xml:space="preserve"> </w:t>
+      </w:r>
+      <w:proofErr w:type="spellStart"/>
+      <w:r>
+        <w:rPr>
+          <w:rFonts w:ascii="Times New Roman" w:hAnsi="Times New Roman" w:cs="Times New Roman"/>
+          <w:b/>
+          <w:bCs/>
+          <w:sz w:val="26"/>
+          <w:szCs w:val="26"/>
+        </w:rPr>
+        <w:t>tra</w:t>
+      </w:r>
+      <w:proofErr w:type="spellEnd"/>
+      <w:r>
+        <w:rPr>
+          <w:rFonts w:ascii="Times New Roman" w:hAnsi="Times New Roman" w:cs="Times New Roman"/>
+          <w:b/>
+          <w:bCs/>
+          <w:sz w:val="26"/>
+          <w:szCs w:val="26"/>
+        </w:rPr>
+        <w:t xml:space="preserve"> </w:t>
+      </w:r>
+      <w:proofErr w:type="spellStart"/>
+      <w:r>
+        <w:rPr>
+          <w:rFonts w:ascii="Times New Roman" w:hAnsi="Times New Roman" w:cs="Times New Roman"/>
+          <w:b/>
+          <w:bCs/>
+          <w:sz w:val="26"/>
+          <w:szCs w:val="26"/>
+        </w:rPr>
+        <w:t>đường</w:t>
+      </w:r>
+      <w:proofErr w:type="spellEnd"/>
+      <w:r>
+        <w:rPr>
+          <w:rFonts w:ascii="Times New Roman" w:hAnsi="Times New Roman" w:cs="Times New Roman"/>
+          <w:b/>
+          <w:bCs/>
+          <w:sz w:val="26"/>
+          <w:szCs w:val="26"/>
+        </w:rPr>
+        <w:t xml:space="preserve"> WAN/DNS </w:t>
+      </w:r>
+      <w:proofErr w:type="spellStart"/>
+      <w:r>
+        <w:rPr>
+          <w:rFonts w:ascii="Times New Roman" w:hAnsi="Times New Roman" w:cs="Times New Roman"/>
+          <w:b/>
+          <w:bCs/>
+          <w:sz w:val="26"/>
+          <w:szCs w:val="26"/>
+        </w:rPr>
+        <w:t>của</w:t>
+      </w:r>
+      <w:proofErr w:type="spellEnd"/>
+      <w:r>
+        <w:rPr>
+          <w:rFonts w:ascii="Times New Roman" w:hAnsi="Times New Roman" w:cs="Times New Roman"/>
+          <w:b/>
+          <w:bCs/>
+          <w:sz w:val="26"/>
+          <w:szCs w:val="26"/>
+        </w:rPr>
+        <w:t xml:space="preserve"> </w:t>
+      </w:r>
+      <w:proofErr w:type="spellStart"/>
+      <w:r>
+        <w:rPr>
+          <w:rFonts w:ascii="Times New Roman" w:hAnsi="Times New Roman" w:cs="Times New Roman"/>
+          <w:b/>
+          <w:bCs/>
+          <w:sz w:val="26"/>
+          <w:szCs w:val="26"/>
+        </w:rPr>
+        <w:t>chính</w:t>
+      </w:r>
+      <w:proofErr w:type="spellEnd"/>
+      <w:r>
+        <w:rPr>
+          <w:rFonts w:ascii="Times New Roman" w:hAnsi="Times New Roman" w:cs="Times New Roman"/>
+          <w:b/>
+          <w:bCs/>
+          <w:sz w:val="26"/>
+          <w:szCs w:val="26"/>
+        </w:rPr>
+        <w:t xml:space="preserve"> </w:t>
+      </w:r>
+      <w:proofErr w:type="spellStart"/>
+      <w:r>
+        <w:rPr>
+          <w:rFonts w:ascii="Times New Roman" w:hAnsi="Times New Roman" w:cs="Times New Roman"/>
+          <w:b/>
+          <w:bCs/>
+          <w:sz w:val="26"/>
+          <w:szCs w:val="26"/>
+        </w:rPr>
+        <w:t>pfSense</w:t>
+      </w:r>
+      <w:proofErr w:type="spellEnd"/>
+      <w:r>
+        <w:rPr>
+          <w:rFonts w:ascii="Times New Roman" w:hAnsi="Times New Roman" w:cs="Times New Roman"/>
+          <w:b/>
+          <w:bCs/>
+          <w:sz w:val="26"/>
+          <w:szCs w:val="26"/>
+        </w:rPr>
+        <w:t xml:space="preserve"> </w:t>
+      </w:r>
+      <w:proofErr w:type="spellStart"/>
+      <w:r>
+        <w:rPr>
+          <w:rFonts w:ascii="Times New Roman" w:hAnsi="Times New Roman" w:cs="Times New Roman"/>
+          <w:b/>
+          <w:bCs/>
+          <w:sz w:val="26"/>
+          <w:szCs w:val="26"/>
+        </w:rPr>
+        <w:t>bằng</w:t>
+      </w:r>
+      <w:proofErr w:type="spellEnd"/>
+      <w:r>
+        <w:rPr>
+          <w:rFonts w:ascii="Times New Roman" w:hAnsi="Times New Roman" w:cs="Times New Roman"/>
+          <w:b/>
+          <w:bCs/>
+          <w:sz w:val="26"/>
+          <w:szCs w:val="26"/>
+        </w:rPr>
+        <w:t xml:space="preserve"> Diagnostics</w:t>
+      </w:r>
+    </w:p>
+    <w:p>
+      <w:pPr>
+        <w:rPr>
+          <w:rFonts w:ascii="Times New Roman" w:hAnsi="Times New Roman" w:cs="Times New Roman"/>
+          <w:b/>
+          <w:bCs/>
+          <w:sz w:val="26"/>
+          <w:szCs w:val="26"/>
+        </w:rPr>
+      </w:pPr>
+      <w:r>
+        <w:rPr>
+          <w:rFonts w:ascii="Times New Roman" w:hAnsi="Times New Roman" w:cs="Times New Roman"/>
+          <w:b/>
+          <w:bCs/>
+          <w:noProof/>
+          <w:sz w:val="26"/>
+          <w:szCs w:val="26"/>
+        </w:rPr>
+        <w:lastRenderedPageBreak/>
+        <w:drawing>
+          <wp:inline distT="0" distB="0" distL="0" distR="0" wp14:anchorId="75818D27" wp14:editId="158DBCDB">
+            <wp:extent cx="5943600" cy="4161790"/>
+            <wp:effectExtent l="0" t="0" r="0" b="0"/>
+            <wp:docPr id="22" name="Picture 22" descr="pfSense.home.arpa - Diagnostics: Ping - School - Microsoft​ Edge"/>
+            <wp:cNvGraphicFramePr>
+              <a:graphicFrameLocks xmlns:a="http://schemas.openxmlformats.org/drawingml/2006/main" noChangeAspect="1"/>
+            </wp:cNvGraphicFramePr>
+            <a:graphic xmlns:a="http://schemas.openxmlformats.org/drawingml/2006/main">
+              <a:graphicData uri="http://schemas.openxmlformats.org/drawingml/2006/picture">
+                <pic:pic xmlns:pic="http://schemas.openxmlformats.org/drawingml/2006/picture">
+                  <pic:nvPicPr>
+                    <pic:cNvPr id="22" name="Picture 22" descr="pfSense.home.arpa - Diagnostics: Ping - School - Microsoft​ Edge"/>
+                    <pic:cNvPicPr/>
+                  </pic:nvPicPr>
+                  <pic:blipFill>
+                    <a:blip r:embed="rId25" cstate="print">
+                      <a:extLst>
+                        <a:ext uri="{28A0092B-C50C-407E-A947-70E740481C1C}">
+                          <a14:useLocalDpi xmlns:a14="http://schemas.microsoft.com/office/drawing/2010/main" val="0"/>
+                        </a:ext>
+                      </a:extLst>
+                    </a:blip>
+                    <a:stretch>
+                      <a:fillRect/>
+                    </a:stretch>
+                  </pic:blipFill>
+                  <pic:spPr>
+                    <a:xfrm>
+                      <a:off x="0" y="0"/>
+                      <a:ext cx="5943600" cy="4161790"/>
+                    </a:xfrm>
+                    <a:prstGeom prst="rect">
+                      <a:avLst/>
+                    </a:prstGeom>
+                  </pic:spPr>
+                </pic:pic>
+              </a:graphicData>
+            </a:graphic>
+          </wp:inline>
+        </w:drawing>
+      </w:r>
+    </w:p>
+    <w:p>
+      <w:pPr>
+        <w:rPr>
+          <w:rFonts w:ascii="Times New Roman" w:hAnsi="Times New Roman" w:cs="Times New Roman"/>
+          <w:b/>
+          <w:bCs/>
+          <w:sz w:val="26"/>
+          <w:szCs w:val="26"/>
+        </w:rPr>
+      </w:pPr>
       <w:bookmarkStart w:id="1" w:name="_Toc242090294"/>
       <w:r>
         <w:rPr>
@@ -3525,7 +3517,7 @@
                     <pic:cNvPicPr/>
                   </pic:nvPicPr>
                   <pic:blipFill>
-                    <a:blip r:embed="rId25">
+                    <a:blip r:embed="rId26">
                       <a:extLst>
                         <a:ext uri="{28A0092B-C50C-407E-A947-70E740481C1C}">
                           <a14:useLocalDpi xmlns:a14="http://schemas.microsoft.com/office/drawing/2010/main" val="0"/>
@@ -3621,7 +3613,7 @@
                     <pic:cNvPicPr/>
                   </pic:nvPicPr>
                   <pic:blipFill>
-                    <a:blip r:embed="rId26">
+                    <a:blip r:embed="rId27">
                       <a:extLst>
                         <a:ext uri="{28A0092B-C50C-407E-A947-70E740481C1C}">
                           <a14:useLocalDpi xmlns:a14="http://schemas.microsoft.com/office/drawing/2010/main" val="0"/>
@@ -4609,7 +4601,7 @@
                     <pic:cNvPicPr/>
                   </pic:nvPicPr>
                   <pic:blipFill>
-                    <a:blip r:embed="rId27">
+                    <a:blip r:embed="rId28">
                       <a:extLst>
                         <a:ext uri="{28A0092B-C50C-407E-A947-70E740481C1C}">
                           <a14:useLocalDpi xmlns:a14="http://schemas.microsoft.com/office/drawing/2010/main" val="0"/>
@@ -4718,7 +4710,7 @@
                     <pic:cNvPicPr/>
                   </pic:nvPicPr>
                   <pic:blipFill>
-                    <a:blip r:embed="rId28">
+                    <a:blip r:embed="rId29">
                       <a:extLst>
                         <a:ext uri="{28A0092B-C50C-407E-A947-70E740481C1C}">
                           <a14:useLocalDpi xmlns:a14="http://schemas.microsoft.com/office/drawing/2010/main" val="0"/>
@@ -4803,7 +4795,7 @@
                     <pic:cNvPicPr/>
                   </pic:nvPicPr>
                   <pic:blipFill>
-                    <a:blip r:embed="rId29">
+                    <a:blip r:embed="rId30">
                       <a:extLst>
                         <a:ext uri="{28A0092B-C50C-407E-A947-70E740481C1C}">
                           <a14:useLocalDpi xmlns:a14="http://schemas.microsoft.com/office/drawing/2010/main" val="0"/>
@@ -4894,7 +4886,7 @@
 </file>
 
 <file path=word/numbering.xml><?xml version="1.0" encoding="utf-8"?>
-<w:numbering xmlns:wpc="http://schemas.microsoft.com/office/word/2010/wordprocessingCanvas" xmlns:cx="http://schemas.microsoft.com/office/drawing/2014/chartex" xmlns:cx1="http://schemas.microsoft.com/office/drawing/2015/9/8/chartex" xmlns:cx2="http://schemas.microsoft.com/office/drawing/2015/10/21/chartex" xmlns:cx3="http://schemas.microsoft.com/office/drawing/2016/5/9/chartex" xmlns:cx4="http://schemas.microsoft.com/office/drawing/2016/5/10/chartex" xmlns:cx5="http://schemas.microsoft.com/office/drawing/2016/5/11/chartex" xmlns:cx6="http://schemas.microsoft.com/office/drawing/2016/5/12/chartex" xmlns:cx7="http://schemas.microsoft.com/office/drawing/2016/5/13/chartex" xmlns:cx8="http://schemas.microsoft.com/office/drawing/2016/5/14/chartex" xmlns:mc="http://schemas.openxmlformats.org/markup-compatibility/2006" xmlns:aink="http://schemas.microsoft.com/office/drawing/2016/ink" xmlns:am3d="http://schemas.microsoft.com/office/drawing/2017/model3d" xmlns:o="urn:schemas-microsoft-com:office:office" xmlns:oel="http://schemas.microsoft.com/office/2019/extlst" xmlns:r="http://schemas.openxmlformats.org/officeDocument/2006/relationships" xmlns:m="http://schemas.openxmlformats.org/officeDocument/2006/math" xmlns:v="urn:schemas-microsoft-com:vml" xmlns:wp14="http://schemas.microsoft.com/office/word/2010/wordprocessingDrawing" xmlns:wp="http://schemas.openxmlformats.org/drawingml/2006/wordprocessingDrawing" xmlns:w10="urn:schemas-microsoft-com:office:word" xmlns:w="http://schemas.openxmlformats.org/wordprocessingml/2006/main" xmlns:w14="http://schemas.microsoft.com/office/word/2010/wordml" xmlns:w15="http://schemas.microsoft.com/office/word/2012/wordml" xmlns:w16cex="http://schemas.microsoft.com/office/word/2018/wordml/cex" xmlns:w16cid="http://schemas.microsoft.com/office/word/2016/wordml/cid" xmlns:w16="http://schemas.microsoft.com/office/word/2018/wordml" xmlns:w16sdtdh="http://schemas.microsoft.com/office/word/2020/wordml/sdtdatahash" xmlns:w16se="http://schemas.microsoft.com/office/word/2015/wordml/symex" xmlns:wpg="http://schemas.microsoft.com/office/word/2010/wordprocessingGroup" xmlns:wpi="http://schemas.microsoft.com/office/word/2010/wordprocessingInk" xmlns:wne="http://schemas.microsoft.com/office/word/2006/wordml" xmlns:wps="http://schemas.microsoft.com/office/word/2010/wordprocessingShape" mc:Ignorable="w14 w15 w16se w16cid w16 w16cex w16sdtdh wp14">
+<w:numbering xmlns:wpc="http://schemas.microsoft.com/office/word/2010/wordprocessingCanvas" xmlns:cx="http://schemas.microsoft.com/office/drawing/2014/chartex" xmlns:cx1="http://schemas.microsoft.com/office/drawing/2015/9/8/chartex" xmlns:cx2="http://schemas.microsoft.com/office/drawing/2015/10/21/chartex" xmlns:cx3="http://schemas.microsoft.com/office/drawing/2016/5/9/chartex" xmlns:cx4="http://schemas.microsoft.com/office/drawing/2016/5/10/chartex" xmlns:cx5="http://schemas.microsoft.com/office/drawing/2016/5/11/chartex" xmlns:cx6="http://schemas.microsoft.com/office/drawing/2016/5/12/chartex" xmlns:cx7="http://schemas.microsoft.com/office/drawing/2016/5/13/chartex" xmlns:cx8="http://schemas.microsoft.com/office/drawing/2016/5/14/chartex" xmlns:mc="http://schemas.openxmlformats.org/markup-compatibility/2006" xmlns:aink="http://schemas.microsoft.com/office/drawing/2016/ink" xmlns:am3d="http://schemas.microsoft.com/office/drawing/2017/model3d" xmlns:o="urn:schemas-microsoft-com:office:office" xmlns:oel="http://schemas.microsoft.com/office/2019/extlst" xmlns:r="http://schemas.openxmlformats.org/officeDocument/2006/relationships" xmlns:m="http://schemas.openxmlformats.org/officeDocument/2006/math" xmlns:v="urn:schemas-microsoft-com:vml" xmlns:wp14="http://schemas.microsoft.com/office/word/2010/wordprocessingDrawing" xmlns:wp="http://schemas.openxmlformats.org/drawingml/2006/wordprocessingDrawing" xmlns:w10="urn:schemas-microsoft-com:office:word" xmlns:w="http://schemas.openxmlformats.org/wordprocessingml/2006/main" xmlns:w14="http://schemas.microsoft.com/office/word/2010/wordml" xmlns:w15="http://schemas.microsoft.com/office/word/2012/wordml" xmlns:w16cex="http://schemas.microsoft.com/office/word/2018/wordml/cex" xmlns:w16cid="http://schemas.microsoft.com/office/word/2016/wordml/cid" xmlns:w16="http://schemas.microsoft.com/office/word/2018/wordml" xmlns:w16du="http://schemas.microsoft.com/office/word/2023/wordml/word16du" xmlns:w16sdtdh="http://schemas.microsoft.com/office/word/2020/wordml/sdtdatahash" xmlns:w16sdtfl="http://schemas.microsoft.com/office/word/2024/wordml/sdtformatlock" xmlns:w16se="http://schemas.microsoft.com/office/word/2015/wordml/symex" xmlns:wpg="http://schemas.microsoft.com/office/word/2010/wordprocessingGroup" xmlns:wpi="http://schemas.microsoft.com/office/word/2010/wordprocessingInk" xmlns:wne="http://schemas.microsoft.com/office/word/2006/wordml" xmlns:wps="http://schemas.microsoft.com/office/word/2010/wordprocessingShape" mc:Ignorable="w14 w15 w16se w16cid w16 w16cex w16sdtdh w16sdtfl w16du wp14">
   <w:abstractNum w:abstractNumId="0" w15:restartNumberingAfterBreak="0">
     <w:nsid w:val="22444D26"/>
     <w:multiLevelType w:val="hybridMultilevel"/>
@@ -5245,7 +5237,7 @@
 </file>
 
 <file path=word/styles.xml><?xml version="1.0" encoding="utf-8"?>
-<w:styles xmlns:mc="http://schemas.openxmlformats.org/markup-compatibility/2006" xmlns:r="http://schemas.openxmlformats.org/officeDocument/2006/relationships" xmlns:w="http://schemas.openxmlformats.org/wordprocessingml/2006/main" xmlns:w14="http://schemas.microsoft.com/office/word/2010/wordml" xmlns:w15="http://schemas.microsoft.com/office/word/2012/wordml" xmlns:w16cex="http://schemas.microsoft.com/office/word/2018/wordml/cex" xmlns:w16cid="http://schemas.microsoft.com/office/word/2016/wordml/cid" xmlns:w16="http://schemas.microsoft.com/office/word/2018/wordml" xmlns:w16sdtdh="http://schemas.microsoft.com/office/word/2020/wordml/sdtdatahash" xmlns:w16se="http://schemas.microsoft.com/office/word/2015/wordml/symex" mc:Ignorable="w14 w15 w16se w16cid w16 w16cex w16sdtdh">
+<w:styles xmlns:mc="http://schemas.openxmlformats.org/markup-compatibility/2006" xmlns:r="http://schemas.openxmlformats.org/officeDocument/2006/relationships" xmlns:w="http://schemas.openxmlformats.org/wordprocessingml/2006/main" xmlns:w14="http://schemas.microsoft.com/office/word/2010/wordml" xmlns:w15="http://schemas.microsoft.com/office/word/2012/wordml" xmlns:w16cex="http://schemas.microsoft.com/office/word/2018/wordml/cex" xmlns:w16cid="http://schemas.microsoft.com/office/word/2016/wordml/cid" xmlns:w16="http://schemas.microsoft.com/office/word/2018/wordml" xmlns:w16du="http://schemas.microsoft.com/office/word/2023/wordml/word16du" xmlns:w16sdtdh="http://schemas.microsoft.com/office/word/2020/wordml/sdtdatahash" xmlns:w16sdtfl="http://schemas.microsoft.com/office/word/2024/wordml/sdtformatlock" xmlns:w16se="http://schemas.microsoft.com/office/word/2015/wordml/symex" mc:Ignorable="w14 w15 w16se w16cid w16 w16cex w16sdtdh w16sdtfl w16du">
   <w:docDefaults>
     <w:rPrDefault>
       <w:rPr>
@@ -6180,6 +6172,29 @@
       </w:tblBorders>
     </w:tblPr>
   </w:style>
+  <w:style w:type="character" w:styleId="Hyperlink">
+    <w:name w:val="Hyperlink"/>
+    <w:basedOn w:val="DefaultParagraphFont"/>
+    <w:uiPriority w:val="99"/>
+    <w:unhideWhenUsed/>
+    <w:rsid w:val="00BF447A"/>
+    <w:rPr>
+      <w:color w:val="467886" w:themeColor="hyperlink"/>
+      <w:u w:val="single"/>
+    </w:rPr>
+  </w:style>
+  <w:style w:type="character" w:styleId="UnresolvedMention">
+    <w:name w:val="Unresolved Mention"/>
+    <w:basedOn w:val="DefaultParagraphFont"/>
+    <w:uiPriority w:val="99"/>
+    <w:semiHidden/>
+    <w:unhideWhenUsed/>
+    <w:rsid w:val="00BF447A"/>
+    <w:rPr>
+      <w:color w:val="605E5C"/>
+      <w:shd w:val="clear" w:color="auto" w:fill="E1DFDD"/>
+    </w:rPr>
+  </w:style>
 </w:styles>
 </file>
 

</xml_diff>